<commit_message>
evidence: regenerate packs for the re-run cases
</commit_message>
<xml_diff>
--- a/testing/evidence-packs/TC-INT-053.docx
+++ b/testing/evidence-packs/TC-INT-053.docx
@@ -394,7 +394,7 @@
                 <w:color w:val="1A1A1A"/>
                 <w:sz w:val="18"/>
               </w:rPr>
-              <w:t>https://dev281754.service-now.com</w:t>
+              <w:t>https://orgfarm-4938c7f768-dev-ed.develop.lightning.force.com + https://dev281754.service-now.com</w:t>
             </w:r>
           </w:p>
         </w:tc>
@@ -437,7 +437,7 @@
                 <w:color w:val="1A1A1A"/>
                 <w:sz w:val="18"/>
               </w:rPr>
-              <w:t>admin</w:t>
+              <w:t>admin.070b86ccf531@agentforce.com (Salesforce) / admin (ServiceNow)</w:t>
             </w:r>
           </w:p>
         </w:tc>
@@ -480,7 +480,7 @@
                 <w:color w:val="1A1A1A"/>
                 <w:sz w:val="18"/>
               </w:rPr>
-              <w:t>Playwright (automated); every assertion cross-checked against the ServiceNow Table API</w:t>
+              <w:t>Playwright driving Lightning Experience. Every screen assertion is cross-checked against the ServiceNow record over cnit and the Salesforce record over the sf CLI. No case in this file writes to either platform.</w:t>
             </w:r>
           </w:p>
         </w:tc>
@@ -652,7 +652,7 @@
       <w:r>
         <w:drawing>
           <wp:inline xmlns:a="http://schemas.openxmlformats.org/drawingml/2006/main" xmlns:pic="http://schemas.openxmlformats.org/drawingml/2006/picture">
-            <wp:extent cx="5852160" cy="3657600"/>
+            <wp:extent cx="5852160" cy="5223823"/>
             <wp:docPr id="2" name="Picture 2"/>
             <wp:cNvGraphicFramePr>
               <a:graphicFrameLocks noChangeAspect="1"/>
@@ -673,7 +673,7 @@
                   <pic:spPr>
                     <a:xfrm>
                       <a:off x="0" y="0"/>
-                      <a:ext cx="5852160" cy="3657600"/>
+                      <a:ext cx="5852160" cy="5223823"/>
                     </a:xfrm>
                     <a:prstGeom prst="rect"/>
                   </pic:spPr>
@@ -723,7 +723,7 @@
           <w:color w:val="1A1A1A"/>
           <w:sz w:val="21"/>
         </w:rPr>
-        <w:t>Strip reads "In sync" (green) — 49 records verified · 19 requests · 30 tasks</w:t>
+        <w:t>Strip reads "In sync" (green) — 297 records verified · 109 requests · 182 tasks · 6 controls</w:t>
       </w:r>
     </w:p>
     <w:p>
@@ -963,7 +963,7 @@
                 <w:color w:val="1A1A1A"/>
                 <w:sz w:val="16"/>
               </w:rPr>
-              <w:t>49 records verified · 19 requests · 30 tasks</w:t>
+              <w:t>297 records verified · 109 requests · 182 tas…</w:t>
             </w:r>
           </w:p>
         </w:tc>
@@ -1258,7 +1258,7 @@
                 <w:color w:val="1A1A1A"/>
                 <w:sz w:val="16"/>
               </w:rPr>
-              <w:t>178</w:t>
+              <w:t>872</w:t>
             </w:r>
           </w:p>
         </w:tc>

</xml_diff>